<commit_message>
add point 1 (alcance y perimetro) and 2 (actividades de planificiacion)
</commit_message>
<xml_diff>
--- a/DAW_GRUPO7 1.1.docx
+++ b/DAW_GRUPO7 1.1.docx
@@ -333,23 +333,7 @@
           <w:rFonts w:ascii="Arial" w:hAnsi="Arial"/>
           <w:color w:val="000000"/>
         </w:rPr>
-        <w:t xml:space="preserve">Claudia Andrea Morales Urribarri, Jimmy Estir Vergara </w:t>
-      </w:r>
-      <w:proofErr w:type="gramStart"/>
-      <w:r>
-        <w:rPr>
-          <w:rFonts w:ascii="Arial" w:hAnsi="Arial"/>
-          <w:color w:val="000000"/>
-        </w:rPr>
-        <w:t>Coronel</w:t>
-      </w:r>
-      <w:proofErr w:type="gramEnd"/>
-      <w:r>
-        <w:rPr>
-          <w:rFonts w:ascii="Arial" w:hAnsi="Arial"/>
-          <w:color w:val="000000"/>
-        </w:rPr>
-        <w:t>, Kennys Eduardo Torres Belisario.</w:t>
+        <w:t>Claudia Andrea Morales Urribarri, Jimmy Estir Vergara Coronel, Kennys Eduardo Torres Belisario.</w:t>
       </w:r>
     </w:p>
     <w:p>
@@ -2717,6 +2701,92 @@
         <w:t>. Material docente no publicado.</w:t>
       </w:r>
     </w:p>
+    <w:p/>
+    <w:p/>
+    <w:p/>
+    <w:p/>
+    <w:p/>
+    <w:p>
+      <w:pPr>
+        <w:rPr>
+          <w:lang w:val="es-ES"/>
+        </w:rPr>
+      </w:pPr>
+    </w:p>
+    <w:p>
+      <w:pPr>
+        <w:rPr>
+          <w:lang w:val="es-ES"/>
+        </w:rPr>
+      </w:pPr>
+      <w:r>
+        <w:rPr>
+          <w:lang w:val="es-ES"/>
+        </w:rPr>
+        <w:lastRenderedPageBreak/>
+        <w:t>FASE DE DEFINICION</w:t>
+      </w:r>
+    </w:p>
+    <w:p>
+      <w:pPr>
+        <w:rPr>
+          <w:lang w:val="es-ES"/>
+        </w:rPr>
+      </w:pPr>
+    </w:p>
+    <w:p>
+      <w:pPr>
+        <w:pStyle w:val="ListParagraph"/>
+        <w:numPr>
+          <w:ilvl w:val="0"/>
+          <w:numId w:val="13"/>
+        </w:numPr>
+        <w:rPr>
+          <w:lang w:val="es-ES"/>
+        </w:rPr>
+      </w:pPr>
+      <w:r>
+        <w:rPr>
+          <w:lang w:val="es-ES"/>
+        </w:rPr>
+        <w:t>Alcance y perímetro</w:t>
+      </w:r>
+    </w:p>
+    <w:p>
+      <w:pPr>
+        <w:ind w:left="720"/>
+        <w:rPr>
+          <w:lang w:val="es-ES"/>
+        </w:rPr>
+      </w:pPr>
+      <w:r>
+        <w:rPr>
+          <w:lang w:val="es-ES"/>
+        </w:rPr>
+        <w:t xml:space="preserve">Cualquier cliente de una farmacéutica ha sentido duda en cuanto si hay stock en las farmacia y en lo que lo precios </w:t>
+      </w:r>
+      <w:proofErr w:type="spellStart"/>
+      <w:r>
+        <w:rPr>
+          <w:lang w:val="es-ES"/>
+        </w:rPr>
+        <w:t>varian</w:t>
+      </w:r>
+      <w:proofErr w:type="spellEnd"/>
+      <w:r>
+        <w:rPr>
+          <w:lang w:val="es-ES"/>
+        </w:rPr>
+        <w:t xml:space="preserve"> entre las distintas farmacias, por lo que</w:t>
+      </w:r>
+    </w:p>
+    <w:p>
+      <w:pPr>
+        <w:rPr>
+          <w:lang w:val="es-ES"/>
+        </w:rPr>
+      </w:pPr>
+    </w:p>
     <w:p>
       <w:pPr>
         <w:pStyle w:val="APA"/>
@@ -4228,6 +4298,95 @@
     </w:lvl>
   </w:abstractNum>
   <w:abstractNum w:abstractNumId="10" w15:restartNumberingAfterBreak="0">
+    <w:nsid w:val="6D4820B1"/>
+    <w:multiLevelType w:val="hybridMultilevel"/>
+    <w:tmpl w:val="0630D1BA"/>
+    <w:lvl w:ilvl="0" w:tplc="0C0A000F">
+      <w:start w:val="1"/>
+      <w:numFmt w:val="decimal"/>
+      <w:lvlText w:val="%1."/>
+      <w:lvlJc w:val="left"/>
+      <w:pPr>
+        <w:ind w:left="720" w:hanging="360"/>
+      </w:pPr>
+      <w:rPr>
+        <w:rFonts w:hint="default"/>
+      </w:rPr>
+    </w:lvl>
+    <w:lvl w:ilvl="1" w:tplc="0C0A0019" w:tentative="1">
+      <w:start w:val="1"/>
+      <w:numFmt w:val="lowerLetter"/>
+      <w:lvlText w:val="%2."/>
+      <w:lvlJc w:val="left"/>
+      <w:pPr>
+        <w:ind w:left="1440" w:hanging="360"/>
+      </w:pPr>
+    </w:lvl>
+    <w:lvl w:ilvl="2" w:tplc="0C0A001B" w:tentative="1">
+      <w:start w:val="1"/>
+      <w:numFmt w:val="lowerRoman"/>
+      <w:lvlText w:val="%3."/>
+      <w:lvlJc w:val="right"/>
+      <w:pPr>
+        <w:ind w:left="2160" w:hanging="180"/>
+      </w:pPr>
+    </w:lvl>
+    <w:lvl w:ilvl="3" w:tplc="0C0A000F" w:tentative="1">
+      <w:start w:val="1"/>
+      <w:numFmt w:val="decimal"/>
+      <w:lvlText w:val="%4."/>
+      <w:lvlJc w:val="left"/>
+      <w:pPr>
+        <w:ind w:left="2880" w:hanging="360"/>
+      </w:pPr>
+    </w:lvl>
+    <w:lvl w:ilvl="4" w:tplc="0C0A0019" w:tentative="1">
+      <w:start w:val="1"/>
+      <w:numFmt w:val="lowerLetter"/>
+      <w:lvlText w:val="%5."/>
+      <w:lvlJc w:val="left"/>
+      <w:pPr>
+        <w:ind w:left="3600" w:hanging="360"/>
+      </w:pPr>
+    </w:lvl>
+    <w:lvl w:ilvl="5" w:tplc="0C0A001B" w:tentative="1">
+      <w:start w:val="1"/>
+      <w:numFmt w:val="lowerRoman"/>
+      <w:lvlText w:val="%6."/>
+      <w:lvlJc w:val="right"/>
+      <w:pPr>
+        <w:ind w:left="4320" w:hanging="180"/>
+      </w:pPr>
+    </w:lvl>
+    <w:lvl w:ilvl="6" w:tplc="0C0A000F" w:tentative="1">
+      <w:start w:val="1"/>
+      <w:numFmt w:val="decimal"/>
+      <w:lvlText w:val="%7."/>
+      <w:lvlJc w:val="left"/>
+      <w:pPr>
+        <w:ind w:left="5040" w:hanging="360"/>
+      </w:pPr>
+    </w:lvl>
+    <w:lvl w:ilvl="7" w:tplc="0C0A0019" w:tentative="1">
+      <w:start w:val="1"/>
+      <w:numFmt w:val="lowerLetter"/>
+      <w:lvlText w:val="%8."/>
+      <w:lvlJc w:val="left"/>
+      <w:pPr>
+        <w:ind w:left="5760" w:hanging="360"/>
+      </w:pPr>
+    </w:lvl>
+    <w:lvl w:ilvl="8" w:tplc="0C0A001B" w:tentative="1">
+      <w:start w:val="1"/>
+      <w:numFmt w:val="lowerRoman"/>
+      <w:lvlText w:val="%9."/>
+      <w:lvlJc w:val="right"/>
+      <w:pPr>
+        <w:ind w:left="6480" w:hanging="180"/>
+      </w:pPr>
+    </w:lvl>
+  </w:abstractNum>
+  <w:abstractNum w:abstractNumId="11" w15:restartNumberingAfterBreak="0">
     <w:nsid w:val="7AA96CFF"/>
     <w:multiLevelType w:val="multilevel"/>
     <w:tmpl w:val="A8D0E2E0"/>
@@ -4340,7 +4499,7 @@
       </w:rPr>
     </w:lvl>
   </w:abstractNum>
-  <w:abstractNum w:abstractNumId="11" w15:restartNumberingAfterBreak="0">
+  <w:abstractNum w:abstractNumId="12" w15:restartNumberingAfterBreak="0">
     <w:nsid w:val="7AB073DD"/>
     <w:multiLevelType w:val="multilevel"/>
     <w:tmpl w:val="7C72B55C"/>
@@ -4454,13 +4613,13 @@
     </w:lvl>
   </w:abstractNum>
   <w:num w:numId="1" w16cid:durableId="1294139932">
-    <w:abstractNumId w:val="10"/>
+    <w:abstractNumId w:val="11"/>
   </w:num>
   <w:num w:numId="2" w16cid:durableId="672873231">
     <w:abstractNumId w:val="5"/>
   </w:num>
   <w:num w:numId="3" w16cid:durableId="26297562">
-    <w:abstractNumId w:val="11"/>
+    <w:abstractNumId w:val="12"/>
   </w:num>
   <w:num w:numId="4" w16cid:durableId="35476326">
     <w:abstractNumId w:val="3"/>
@@ -4488,6 +4647,9 @@
   </w:num>
   <w:num w:numId="12" w16cid:durableId="1181624240">
     <w:abstractNumId w:val="7"/>
+  </w:num>
+  <w:num w:numId="13" w16cid:durableId="776022141">
+    <w:abstractNumId w:val="10"/>
   </w:num>
 </w:numbering>
 </file>
@@ -5785,28 +5947,28 @@
 </file>
 
 <file path=customXml/item1.xml><?xml version="1.0" encoding="utf-8"?>
-<b:Sources xmlns:b="http://schemas.openxmlformats.org/officeDocument/2006/bibliography" xmlns="http://schemas.openxmlformats.org/officeDocument/2006/bibliography" SelectedStyle="\APASixthEditionOfficeOnline.xsl" StyleName="APA" Version="6"/>
-</file>
-
-<file path=customXml/item2.xml><?xml version="1.0" encoding="utf-8"?>
 <go:gDocsCustomXmlDataStorage xmlns:go="http://customooxmlschemas.google.com/" xmlns:r="http://schemas.openxmlformats.org/officeDocument/2006/relationships" uri="GoogleDocsCustomDataVersion2">
   <go:docsCustomData xmlns:go="http://customooxmlschemas.google.com/" roundtripDataSignature="AMtx7mi3YeNoVFECQJ8/8ZW5NMdN3Muxjw==">CgMxLjAyDmgucmd6MDhlYWU2dnIwMg5oLmI4Y3VoMGhzaWZ4cTIOaC5lMDV0NTZ5MmNuMTgyDmguOTNmNnp4ZmhsNWxmMg5oLjJveDFtaW5qNjY3ZjIOaC5tNmVwaXVhNWNxZTEyDmgucWJ4dXdhd3JncjAyOAByITFiWXpXVkF0U2d4dUhUbURJbkozQ0ZWbHQ3Nmx2OExVbQ==</go:docsCustomData>
 </go:gDocsCustomXmlDataStorage>
 </file>
 
-<file path=customXml/itemProps1.xml><?xml version="1.0" encoding="utf-8"?>
-<ds:datastoreItem xmlns:ds="http://schemas.openxmlformats.org/officeDocument/2006/customXml" ds:itemID="{FB272140-6F8D-40EE-A491-139200A25CE3}">
-  <ds:schemaRefs>
-    <ds:schemaRef ds:uri="http://schemas.openxmlformats.org/officeDocument/2006/bibliography"/>
-  </ds:schemaRefs>
-</ds:datastoreItem>
+<file path=customXml/item2.xml><?xml version="1.0" encoding="utf-8"?>
+<b:Sources xmlns:b="http://schemas.openxmlformats.org/officeDocument/2006/bibliography" xmlns="http://schemas.openxmlformats.org/officeDocument/2006/bibliography" SelectedStyle="\APASixthEditionOfficeOnline.xsl" StyleName="APA" Version="6"/>
 </file>
 
-<file path=customXml/itemProps2.xml><?xml version="1.0" encoding="utf-8"?>
+<file path=customXml/itemProps1.xml><?xml version="1.0" encoding="utf-8"?>
 <ds:datastoreItem xmlns:ds="http://schemas.openxmlformats.org/officeDocument/2006/customXml" ds:itemID="{11111111-1234-1234-1234-123412341234}">
   <ds:schemaRefs>
     <ds:schemaRef ds:uri="http://customooxmlschemas.google.com/"/>
     <ds:schemaRef ds:uri="http://schemas.openxmlformats.org/officeDocument/2006/relationships"/>
   </ds:schemaRefs>
 </ds:datastoreItem>
+</file>
+
+<file path=customXml/itemProps2.xml><?xml version="1.0" encoding="utf-8"?>
+<ds:datastoreItem xmlns:ds="http://schemas.openxmlformats.org/officeDocument/2006/customXml" ds:itemID="{FB272140-6F8D-40EE-A491-139200A25CE3}">
+  <ds:schemaRefs>
+    <ds:schemaRef ds:uri="http://schemas.openxmlformats.org/officeDocument/2006/bibliography"/>
+  </ds:schemaRefs>
+</ds:datastoreItem>
 </file>
</xml_diff>